<commit_message>
docs: 更新規格書 v13 — 21.3/21.4 加入實作說明（tracked changes）
Co-Authored-By: Claude Sonnet 4.6 <noreply@anthropic.com>
</commit_message>
<xml_diff>
--- a/docs/trilog_spec_v13.docx
+++ b/docs/trilog_spec_v13.docx
@@ -21123,14 +21123,6 @@
                 <w:szCs w:val="20"/>
               </w:rPr>
               <w:t>上傳完賽證書，觸發公證流程，verification_status 更</w:t>
-            </w:r>
-            <w:r>
-              <w:rPr>
-                <w:rFonts w:eastAsia="Arial"/>
-                <w:color w:val="333333"/>
-                <w:sz w:val="20"/>
-                <w:szCs w:val="20"/>
-              </w:rPr>
               <w:lastRenderedPageBreak/>
               <w:t>新為 pending</w:t>
             </w:r>
@@ -28363,14 +28355,6 @@
                 <w:szCs w:val="20"/>
               </w:rPr>
               <w:t xml:space="preserve">接力排行榜，支援 </w:t>
-            </w:r>
-            <w:r>
-              <w:rPr>
-                <w:rFonts w:eastAsia="Arial"/>
-                <w:color w:val="333333"/>
-                <w:sz w:val="20"/>
-                <w:szCs w:val="20"/>
-              </w:rPr>
               <w:lastRenderedPageBreak/>
               <w:t>distance / gender_category / race_id 篩選</w:t>
             </w:r>
@@ -29439,6 +29423,95 @@
         </w:rPr>
         <w:t>私人成績不受此限制，可在未填寫 Profile 的狀態下儲存私人成績</w:t>
       </w:r>
+    </w:p>
+    <w:p>
+      <w:pPr>
+        <w:spacing w:after="120"/>
+      </w:pPr>
+    </w:p>
+    <w:p>
+      <w:pPr>
+        <w:spacing w:before="80" w:after="60"/>
+        <w:rPr>
+          <w:ins w:id="5001" w:author="Claude" w:date="2026-06-04T00:00:00Z"/>
+        </w:rPr>
+      </w:pPr>
+      <w:ins w:id="5002" w:author="Claude" w:date="2026-06-04T00:00:00Z">
+        <w:r>
+          <w:rPr>
+            <w:rFonts w:eastAsia="Arial"/>
+            <w:b/>
+            <w:color w:val="1A5C2A"/>
+          </w:rPr>
+          <w:t>實作說明（2026-06-04）</w:t>
+        </w:r>
+      </w:ins>
+    </w:p>
+    <w:p>
+      <w:pPr>
+        <w:pStyle w:val="ListParagraph"/>
+        <w:numPr>
+          <w:ilvl w:val="0"/>
+          <w:numId w:val="2"/>
+        </w:numPr>
+        <w:spacing w:before="40" w:after="60"/>
+        <w:rPr>
+          <w:ins w:id="5003" w:author="Claude" w:date="2026-06-04T00:00:00Z"/>
+        </w:rPr>
+      </w:pPr>
+      <w:ins w:id="5004" w:author="Claude" w:date="2026-06-04T00:00:00Z">
+        <w:r>
+          <w:rPr>
+            <w:rFonts w:eastAsia="Arial"/>
+            <w:color w:val="333333"/>
+          </w:rPr>
+          <w:t>僅顯示尚未填寫的欄位，已有資料的欄位不重複詢問（例：gender 已填則只顯示 nickname 欄位）</w:t>
+        </w:r>
+      </w:ins>
+    </w:p>
+    <w:p>
+      <w:pPr>
+        <w:pStyle w:val="ListParagraph"/>
+        <w:numPr>
+          <w:ilvl w:val="0"/>
+          <w:numId w:val="2"/>
+        </w:numPr>
+        <w:spacing w:before="40" w:after="60"/>
+        <w:rPr>
+          <w:ins w:id="5005" w:author="Claude" w:date="2026-06-04T00:00:00Z"/>
+        </w:rPr>
+      </w:pPr>
+      <w:ins w:id="5006" w:author="Claude" w:date="2026-06-04T00:00:00Z">
+        <w:r>
+          <w:rPr>
+            <w:rFonts w:eastAsia="Arial"/>
+            <w:color w:val="333333"/>
+          </w:rPr>
+          <w:t xml:space="preserve">公開 / 私人 checkbox 即時切換補充區塊顯示狀態（React state 驅動，無需重新載入）</w:t>
+        </w:r>
+      </w:ins>
+    </w:p>
+    <w:p>
+      <w:pPr>
+        <w:pStyle w:val="ListParagraph"/>
+        <w:numPr>
+          <w:ilvl w:val="0"/>
+          <w:numId w:val="2"/>
+        </w:numPr>
+        <w:spacing w:before="40" w:after="60"/>
+        <w:rPr>
+          <w:ins w:id="5007" w:author="Claude" w:date="2026-06-04T00:00:00Z"/>
+        </w:rPr>
+      </w:pPr>
+      <w:ins w:id="5008" w:author="Claude" w:date="2026-06-04T00:00:00Z">
+        <w:r>
+          <w:rPr>
+            <w:rFonts w:eastAsia="Arial"/>
+            <w:color w:val="333333"/>
+          </w:rPr>
+          <w:t xml:space="preserve">createResult server action 在插入成績前先更新 athletes 表，再二次驗證完整性，不完整則阻擋提交並回傳錯誤</w:t>
+        </w:r>
+      </w:ins>
     </w:p>
     <w:p>
       <w:pPr>
@@ -30372,6 +30445,90 @@
     </w:p>
     <w:p>
       <w:pPr>
+        <w:spacing w:before="80" w:after="60"/>
+        <w:rPr>
+          <w:ins w:id="5010" w:author="Claude" w:date="2026-06-04T00:00:00Z"/>
+        </w:rPr>
+      </w:pPr>
+      <w:ins w:id="5011" w:author="Claude" w:date="2026-06-04T00:00:00Z">
+        <w:r>
+          <w:rPr>
+            <w:rFonts w:eastAsia="Arial"/>
+            <w:b/>
+            <w:color w:val="1A5C2A"/>
+          </w:rPr>
+          <w:t>實作說明（2026-06-04）</w:t>
+        </w:r>
+      </w:ins>
+    </w:p>
+    <w:p>
+      <w:pPr>
+        <w:pStyle w:val="ListParagraph"/>
+        <w:numPr>
+          <w:ilvl w:val="0"/>
+          <w:numId w:val="2"/>
+        </w:numPr>
+        <w:spacing w:before="40" w:after="60"/>
+        <w:rPr>
+          <w:ins w:id="5012" w:author="Claude" w:date="2026-06-04T00:00:00Z"/>
+        </w:rPr>
+      </w:pPr>
+      <w:ins w:id="5013" w:author="Claude" w:date="2026-06-04T00:00:00Z">
+        <w:r>
+          <w:rPr>
+            <w:rFonts w:eastAsia="Arial"/>
+            <w:color w:val="333333"/>
+          </w:rPr>
+          <w:t xml:space="preserve">UI 入口：「我的紀錄」（/records）頁面，僅對 source_credibility = ‘official’ 且 claim_status = ‘claimed’ 的成績顯示「解除關聯」按鈕（UnlinkButton 元件）</w:t>
+        </w:r>
+      </w:ins>
+    </w:p>
+    <w:p>
+      <w:pPr>
+        <w:pStyle w:val="ListParagraph"/>
+        <w:numPr>
+          <w:ilvl w:val="0"/>
+          <w:numId w:val="2"/>
+        </w:numPr>
+        <w:spacing w:before="40" w:after="60"/>
+        <w:rPr>
+          <w:ins w:id="5014" w:author="Claude" w:date="2026-06-04T00:00:00Z"/>
+        </w:rPr>
+      </w:pPr>
+      <w:ins w:id="5015" w:author="Claude" w:date="2026-06-04T00:00:00Z">
+        <w:r>
+          <w:rPr>
+            <w:rFonts w:eastAsia="Arial"/>
+            <w:color w:val="333333"/>
+          </w:rPr>
+          <w:t xml:space="preserve">需二次確認後才執行，呼叫 unlink_result() DB Function，athlete_id 設為 null，claim_status 更新為 ‘unlinked’</w:t>
+        </w:r>
+      </w:ins>
+    </w:p>
+    <w:p>
+      <w:pPr>
+        <w:pStyle w:val="ListParagraph"/>
+        <w:numPr>
+          <w:ilvl w:val="0"/>
+          <w:numId w:val="2"/>
+        </w:numPr>
+        <w:spacing w:before="40" w:after="60"/>
+        <w:rPr>
+          <w:ins w:id="5016" w:author="Claude" w:date="2026-06-04T00:00:00Z"/>
+        </w:rPr>
+      </w:pPr>
+      <w:ins w:id="5017" w:author="Claude" w:date="2026-06-04T00:00:00Z">
+        <w:r>
+          <w:rPr>
+            <w:rFonts w:eastAsia="Arial"/>
+            <w:color w:val="333333"/>
+          </w:rPr>
+          <w:t xml:space="preserve">自填成績（self_reported）顯示「編輯」「刪除」按鈕；官方成績（official）+ 已公證成績（certificate）不顯示編輯刪除，避免覆蓋有公信力的資料</w:t>
+        </w:r>
+      </w:ins>
+    </w:p>
+    <w:p>
+      <w:pPr>
         <w:spacing w:after="240"/>
       </w:pPr>
     </w:p>
@@ -43221,6 +43378,84 @@
     </w:sectPr>
   </w:body>
 </w:document>
+</file>
+
+<file path=word/comments.xml><?xml version="1.0" encoding="utf-8"?>
+<w:comments xmlns:cx="http://schemas.microsoft.com/office/drawing/2014/chartex" xmlns:cx1="http://schemas.microsoft.com/office/drawing/2015/9/8/chartex" xmlns:cx2="http://schemas.microsoft.com/office/drawing/2015/10/21/chartex" xmlns:cx3="http://schemas.microsoft.com/office/drawing/2016/5/9/chartex" xmlns:cx4="http://schemas.microsoft.com/office/drawing/2016/5/10/chartex" xmlns:cx5="http://schemas.microsoft.com/office/drawing/2016/5/11/chartex" xmlns:cx6="http://schemas.microsoft.com/office/drawing/2016/5/12/chartex" xmlns:cx7="http://schemas.microsoft.com/office/drawing/2016/5/13/chartex" xmlns:cx8="http://schemas.microsoft.com/office/drawing/2016/5/14/chartex" xmlns:mc="http://schemas.openxmlformats.org/markup-compatibility/2006" xmlns:aink="http://schemas.microsoft.com/office/drawing/2016/ink" xmlns:am3d="http://schemas.microsoft.com/office/drawing/2017/model3d" xmlns:o="urn:schemas-microsoft-com:office:office" xmlns:r="http://schemas.openxmlformats.org/officeDocument/2006/relationships" xmlns:m="http://schemas.openxmlformats.org/officeDocument/2006/math" xmlns:v="urn:schemas-microsoft-com:vml" xmlns:wp14="http://schemas.microsoft.com/office/word/2010/wordprocessingDrawing" xmlns:wp="http://schemas.openxmlformats.org/drawingml/2006/wordprocessingDrawing" xmlns:w10="urn:schemas-microsoft-com:office:word" xmlns:w="http://schemas.openxmlformats.org/wordprocessingml/2006/main" xmlns:w14="http://schemas.microsoft.com/office/word/2010/wordml" xmlns:w15="http://schemas.microsoft.com/office/word/2012/wordml" xmlns:w16cex="http://schemas.microsoft.com/office/word/2018/wordml/cex" xmlns:w16cid="http://schemas.microsoft.com/office/word/2016/wordml/cid" xmlns:w16="http://schemas.microsoft.com/office/word/2018/wordml" xmlns:w16sdtdh="http://schemas.microsoft.com/office/word/2020/wordml/sdtdatahash" xmlns:w16se="http://schemas.microsoft.com/office/word/2015/wordml/symex" xmlns:wpg="http://schemas.microsoft.com/office/word/2010/wordprocessingGroup" xmlns:wpi="http://schemas.microsoft.com/office/word/2010/wordprocessingInk" xmlns:wne="http://schemas.microsoft.com/office/word/2006/wordml" xmlns:wps="http://schemas.microsoft.com/office/word/2010/wordprocessingShape"/>
+</file>
+
+<file path=word/endnotes.xml><?xml version="1.0" encoding="utf-8"?>
+<w:endnotes xmlns:wpc="http://schemas.microsoft.com/office/word/2010/wordprocessingCanvas" xmlns:mc="http://schemas.openxmlformats.org/markup-compatibility/2006" xmlns:o="urn:schemas-microsoft-com:office:office" xmlns:r="http://schemas.openxmlformats.org/officeDocument/2006/relationships" xmlns:m="http://schemas.openxmlformats.org/officeDocument/2006/math" xmlns:v="urn:schemas-microsoft-com:vml" xmlns:wp14="http://schemas.microsoft.com/office/word/2010/wordprocessingDrawing" xmlns:wp="http://schemas.openxmlformats.org/drawingml/2006/wordprocessingDrawing" xmlns:w10="urn:schemas-microsoft-com:office:word" xmlns:w="http://schemas.openxmlformats.org/wordprocessingml/2006/main" xmlns:w14="http://schemas.microsoft.com/office/word/2010/wordml" xmlns:w15="http://schemas.microsoft.com/office/word/2012/wordml" xmlns:wpg="http://schemas.microsoft.com/office/word/2010/wordprocessingGroup" xmlns:wpi="http://schemas.microsoft.com/office/word/2010/wordprocessingInk" xmlns:wne="http://schemas.microsoft.com/office/word/2006/wordml" xmlns:wps="http://schemas.microsoft.com/office/word/2010/wordprocessingShape" mc:Ignorable="w14 w15 wp14">
+  <w:endnote w:type="separator" w:id="-1">
+    <w:p>
+      <w:pPr>
+        <w:spacing w:after="0" w:line="240" w:lineRule="auto"/>
+      </w:pPr>
+      <w:r>
+        <w:rPr>
+          <w:rStyle w:val="EndnoteReference"/>
+        </w:rPr>
+        <w:endnoteRef/>
+      </w:r>
+      <w:r>
+        <w:separator/>
+      </w:r>
+    </w:p>
+  </w:endnote>
+  <w:endnote w:type="continuationSeparator" w:id="0">
+    <w:p>
+      <w:pPr>
+        <w:spacing w:after="0" w:line="240" w:lineRule="auto"/>
+      </w:pPr>
+      <w:r>
+        <w:rPr>
+          <w:rStyle w:val="EndnoteReference"/>
+        </w:rPr>
+        <w:endnoteRef/>
+      </w:r>
+      <w:r>
+        <w:continuationSeparator/>
+      </w:r>
+    </w:p>
+  </w:endnote>
+</w:endnotes>
+</file>
+
+<file path=word/footnotes.xml><?xml version="1.0" encoding="utf-8"?>
+<w:footnotes xmlns:wpc="http://schemas.microsoft.com/office/word/2010/wordprocessingCanvas" xmlns:mc="http://schemas.openxmlformats.org/markup-compatibility/2006" xmlns:o="urn:schemas-microsoft-com:office:office" xmlns:r="http://schemas.openxmlformats.org/officeDocument/2006/relationships" xmlns:m="http://schemas.openxmlformats.org/officeDocument/2006/math" xmlns:v="urn:schemas-microsoft-com:vml" xmlns:wp14="http://schemas.microsoft.com/office/word/2010/wordprocessingDrawing" xmlns:wp="http://schemas.openxmlformats.org/drawingml/2006/wordprocessingDrawing" xmlns:w10="urn:schemas-microsoft-com:office:word" xmlns:w="http://schemas.openxmlformats.org/wordprocessingml/2006/main" xmlns:w14="http://schemas.microsoft.com/office/word/2010/wordml" xmlns:w15="http://schemas.microsoft.com/office/word/2012/wordml" xmlns:wpg="http://schemas.microsoft.com/office/word/2010/wordprocessingGroup" xmlns:wpi="http://schemas.microsoft.com/office/word/2010/wordprocessingInk" xmlns:wne="http://schemas.microsoft.com/office/word/2006/wordml" xmlns:wps="http://schemas.microsoft.com/office/word/2010/wordprocessingShape" mc:Ignorable="w14 w15 wp14">
+  <w:footnote w:type="separator" w:id="-1">
+    <w:p>
+      <w:pPr>
+        <w:spacing w:after="0" w:line="240" w:lineRule="auto"/>
+      </w:pPr>
+      <w:r>
+        <w:rPr>
+          <w:rStyle w:val="FootnoteReference"/>
+        </w:rPr>
+        <w:footnoteRef/>
+      </w:r>
+      <w:r>
+        <w:separator/>
+      </w:r>
+    </w:p>
+  </w:footnote>
+  <w:footnote w:type="continuationSeparator" w:id="0">
+    <w:p>
+      <w:pPr>
+        <w:spacing w:after="0" w:line="240" w:lineRule="auto"/>
+      </w:pPr>
+      <w:r>
+        <w:rPr>
+          <w:rStyle w:val="FootnoteReference"/>
+        </w:rPr>
+        <w:footnoteRef/>
+      </w:r>
+      <w:r>
+        <w:continuationSeparator/>
+      </w:r>
+    </w:p>
+  </w:footnote>
+</w:footnotes>
 </file>
 
 <file path=word/numbering.xml><?xml version="1.0" encoding="utf-8"?>

</xml_diff>